<commit_message>
feat: Implement posture alert webhook management and local data backup functionality
- Added WebhookPostureNotificationChannel to handle webhook notifications with improved error handling for webhook URL retrieval.
- Introduced WindowsPostureWebhookCredentialStore to securely manage webhook URLs in Windows Credential Manager.
- Enhanced DashboardViewModel to track scan elapsed time and update UI accordingly.
- Created SettingsViewModel methods for saving and removing posture webhook credentials, along with status messaging.
- Implemented local data backup and restore capabilities in SettingsViewModel, with UI integration for backup operations.
- Updated WorkspaceView to include UI elements for managing posture alert webhooks and local data backups.
- Added unit tests for posture webhook URL validation and local data backup service functionality.
- Modified navigation tests to allow multiple provider sign-ins and ensure proper scanning behavior.
</commit_message>
<xml_diff>
--- a/docs/user-guide/YASK-CIEM-Study-Material.docx
+++ b/docs/user-guide/YASK-CIEM-Study-Material.docx
@@ -1348,14 +1348,7 @@
           <w:b w:val="0"/>
           <w:i w:val="0"/>
         </w:rPr>
-        <w:t xml:space="preserve">You connect with your existing CLI identity. </w:t>
-      </w:r>
-      <w:r>
-        <w:rPr>
-          <w:b/>
-          <w:i w:val="0"/>
-        </w:rPr>
-        <w:t>Connect one provider at a time.</w:t>
+        <w:t>Connect Azure, AWS, and Google Cloud independently with their existing CLI identities. You may keep multiple providers connected; only one interactive sign-in flow runs at a time. Each provider retains its own account scope and scan coverage.</w:t>
       </w:r>
     </w:p>
     <w:p>
@@ -1526,7 +1519,7 @@
           <w:b w:val="0"/>
           <w:i w:val="0"/>
         </w:rPr>
-        <w:t>The left card shows, for example, "Azure connected".</w:t>
+        <w:t>The provider card shows its connection status. Repeat for another provider if needed.</w:t>
       </w:r>
     </w:p>
     <w:p>
@@ -1535,7 +1528,7 @@
           <w:b w:val="0"/>
           <w:i w:val="0"/>
         </w:rPr>
-        <w:t xml:space="preserve">To sign out, use </w:t>
+        <w:t xml:space="preserve">To sign out of one provider, use </w:t>
       </w:r>
       <w:r>
         <w:rPr>
@@ -1549,7 +1542,7 @@
           <w:b w:val="0"/>
           <w:i w:val="0"/>
         </w:rPr>
-        <w:t xml:space="preserve"> on the provider card, or </w:t>
+        <w:t xml:space="preserve"> on that provider card. </w:t>
       </w:r>
       <w:r>
         <w:rPr>
@@ -1563,7 +1556,7 @@
           <w:b w:val="0"/>
           <w:i w:val="0"/>
         </w:rPr>
-        <w:t xml:space="preserve"> in the header (also cancels a pending sign-in).</w:t>
+        <w:t xml:space="preserve"> opens Cloud Accounts; use the provider-specific Disconnect action. A pending sign-in can be canceled separately.</w:t>
       </w:r>
     </w:p>
     <w:p>
@@ -2158,7 +2151,7 @@
           <w:b w:val="0"/>
           <w:i w:val="0"/>
         </w:rPr>
-        <w:t>, open the account list, tick the accounts to scan (</w:t>
+        <w:t>, open the account list, tick the cloud accounts and Kubernetes contexts to scan (</w:t>
       </w:r>
       <w:r>
         <w:rPr>
@@ -2186,7 +2179,7 @@
           <w:b w:val="0"/>
           <w:i w:val="0"/>
         </w:rPr>
-        <w:t>). If you do not pick, all accounts are scanned.</w:t>
+        <w:t>). If you do not pick, all discovered scopes are scanned.</w:t>
       </w:r>
     </w:p>
     <w:p>
@@ -2212,7 +2205,7 @@
           <w:b w:val="0"/>
           <w:i w:val="0"/>
         </w:rPr>
-        <w:t>. "Cloud scan in progress" appears with a moving bar.</w:t>
+        <w:t>. The status reports the current provider, account and data source as discovery proceeds.</w:t>
       </w:r>
     </w:p>
     <w:p>
@@ -2224,7 +2217,21 @@
           <w:b w:val="0"/>
           <w:i w:val="0"/>
         </w:rPr>
-        <w:t>Wait for completion. A summary line shows accounts, identities, resources and effective-access assignments, and how many sources need attention.</w:t>
+        <w:t xml:space="preserve">Wait for completion. A summary line shows accounts, identities, resources and effective-access assignments, and how many sources need attention. Failed or unavailable sources remain visible in </w:t>
+      </w:r>
+      <w:r>
+        <w:rPr>
+          <w:b/>
+          <w:i w:val="0"/>
+        </w:rPr>
+        <w:t>Source coverage</w:t>
+      </w:r>
+      <w:r>
+        <w:rPr>
+          <w:b w:val="0"/>
+          <w:i w:val="0"/>
+        </w:rPr>
+        <w:t>.</w:t>
       </w:r>
     </w:p>
     <w:p>
@@ -2245,7 +2252,21 @@
           <w:b w:val="0"/>
           <w:i w:val="0"/>
         </w:rPr>
-        <w:t>Typical duration is about a minute for a small tenant and longer for large tenants. Entra lookups are capped (directory discovery stops after 4 minutes and results are marked partial).</w:t>
+        <w:t xml:space="preserve">The scan includes all connected providers and selected accounts/contexts for each. Kubernetes context discovery reads local kubeconfig; RBAC calls run only for selected contexts. Typical duration is about a minute for a small tenant and longer for large tenants. Entra lookups are capped (directory discovery stops after 4 minutes and results are marked partial). </w:t>
+      </w:r>
+      <w:r>
+        <w:rPr>
+          <w:b/>
+          <w:i w:val="0"/>
+        </w:rPr>
+        <w:t>Stop Scan</w:t>
+      </w:r>
+      <w:r>
+        <w:rPr>
+          <w:b w:val="0"/>
+          <w:i w:val="0"/>
+        </w:rPr>
+        <w:t xml:space="preserve"> cancels the current scan; the last completed scan remains available.</w:t>
       </w:r>
     </w:p>
     <w:p>
@@ -4776,6 +4797,38 @@
             <w:r/>
             <w:r>
               <w:rPr>
+                <w:b/>
+                <w:i w:val="0"/>
+              </w:rPr>
+              <w:t>Posture alerts</w:t>
+            </w:r>
+          </w:p>
+        </w:tc>
+        <w:tc>
+          <w:tcPr>
+            <w:tcW w:type="dxa" w:w="5112"/>
+          </w:tcPr>
+          <w:p>
+            <w:r/>
+            <w:r>
+              <w:rPr>
+                <w:b w:val="0"/>
+                <w:i w:val="0"/>
+              </w:rPr>
+              <w:t>Save an organization-approved HTTPS webhook endpoint. It is protected in Windows Credential Manager; eligible high-impact posture changes are delivered after a scan</w:t>
+            </w:r>
+          </w:p>
+        </w:tc>
+      </w:tr>
+      <w:tr>
+        <w:tc>
+          <w:tcPr>
+            <w:tcW w:type="dxa" w:w="5112"/>
+          </w:tcPr>
+          <w:p>
+            <w:r/>
+            <w:r>
+              <w:rPr>
                 <w:b w:val="0"/>
                 <w:i w:val="0"/>
               </w:rPr>
@@ -4867,7 +4920,7 @@
         <w:keepNext/>
       </w:pPr>
       <w:r>
-        <w:t>Part 9 - Feedback</w:t>
+        <w:t>Part 9 - Local backup and restore</w:t>
       </w:r>
     </w:p>
     <w:p>
@@ -4883,55 +4936,165 @@
           <w:b/>
           <w:i w:val="0"/>
         </w:rPr>
-        <w:t>Feedback</w:t>
+        <w:t>Settings &gt; Local Data Backup</w:t>
       </w:r>
       <w:r>
         <w:rPr>
           <w:b w:val="0"/>
           <w:i w:val="0"/>
         </w:rPr>
-        <w:t xml:space="preserve">, fill in </w:t>
-      </w:r>
+        <w:t>:</w:t>
+      </w:r>
+    </w:p>
+    <w:p>
+      <w:pPr>
+        <w:pStyle w:val="ListNumber"/>
+      </w:pPr>
       <w:r>
         <w:rPr>
           <w:b/>
           <w:i w:val="0"/>
         </w:rPr>
-        <w:t>Your feedback</w:t>
+        <w:t>Create backup</w:t>
       </w:r>
       <w:r>
         <w:rPr>
           <w:b w:val="0"/>
           <w:i w:val="0"/>
         </w:rPr>
-        <w:t xml:space="preserve"> and </w:t>
-      </w:r>
+        <w:t xml:space="preserve"> saves a </w:t>
+      </w:r>
+      <w:r>
+        <w:rPr>
+          <w:rFonts w:ascii="Consolas" w:hAnsi="Consolas"/>
+          <w:b w:val="0"/>
+          <w:i w:val="0"/>
+          <w:sz w:val="18"/>
+        </w:rPr>
+        <w:t>.yaskbackup</w:t>
+      </w:r>
+      <w:r>
+        <w:rPr>
+          <w:b w:val="0"/>
+          <w:i w:val="0"/>
+        </w:rPr>
+        <w:t xml:space="preserve"> archive containing the SQLite database and supported local workflow records, including scan history, access reviews and remediation plans.</w:t>
+      </w:r>
+    </w:p>
+    <w:p>
+      <w:pPr>
+        <w:pStyle w:val="ListNumber"/>
+      </w:pPr>
+      <w:r>
+        <w:rPr>
+          <w:b w:val="0"/>
+          <w:i w:val="0"/>
+        </w:rPr>
+        <w:t>Protect the archive as sensitive identity and access data. Ticketing credentials, webhook endpoints, CLI tokens, logs and generated reports are excluded.</w:t>
+      </w:r>
+    </w:p>
+    <w:p>
+      <w:pPr>
+        <w:pStyle w:val="ListNumber"/>
+      </w:pPr>
       <w:r>
         <w:rPr>
           <w:b/>
           <w:i w:val="0"/>
         </w:rPr>
-        <w:t>Suggestions</w:t>
+        <w:t>Restore backup</w:t>
       </w:r>
       <w:r>
         <w:rPr>
           <w:b w:val="0"/>
           <w:i w:val="0"/>
         </w:rPr>
-        <w:t xml:space="preserve"> (both required), then </w:t>
+        <w:t xml:space="preserve"> replaces the current local database and supported workflow records. Review the confirmation carefully; ticketing and webhook credentials are not changed.</w:t>
+      </w:r>
+    </w:p>
+    <w:p>
+      <w:pPr>
+        <w:pStyle w:val="ListNumber"/>
+      </w:pPr>
+      <w:r>
+        <w:rPr>
+          <w:b w:val="0"/>
+          <w:i w:val="0"/>
+        </w:rPr>
+        <w:t>Close and restart YASK-CIEM after a successful restore so screens reload the restored database.</w:t>
+      </w:r>
+    </w:p>
+    <w:p>
+      <w:pPr>
+        <w:pStyle w:val="Heading1"/>
+        <w:keepNext/>
+      </w:pPr>
+      <w:r>
+        <w:t>Part 10 - Feedback</w:t>
+      </w:r>
+    </w:p>
+    <w:p>
+      <w:r>
+        <w:rPr>
+          <w:b w:val="0"/>
+          <w:i w:val="0"/>
+        </w:rPr>
+        <w:t xml:space="preserve">Open </w:t>
       </w:r>
       <w:r>
         <w:rPr>
           <w:b/>
           <w:i w:val="0"/>
         </w:rPr>
-        <w:t>Submit Feedback</w:t>
+        <w:t>Feedback</w:t>
       </w:r>
       <w:r>
         <w:rPr>
           <w:b w:val="0"/>
           <w:i w:val="0"/>
         </w:rPr>
+        <w:t xml:space="preserve">, fill in </w:t>
+      </w:r>
+      <w:r>
+        <w:rPr>
+          <w:b/>
+          <w:i w:val="0"/>
+        </w:rPr>
+        <w:t>Your feedback</w:t>
+      </w:r>
+      <w:r>
+        <w:rPr>
+          <w:b w:val="0"/>
+          <w:i w:val="0"/>
+        </w:rPr>
+        <w:t xml:space="preserve"> and </w:t>
+      </w:r>
+      <w:r>
+        <w:rPr>
+          <w:b/>
+          <w:i w:val="0"/>
+        </w:rPr>
+        <w:t>Suggestions</w:t>
+      </w:r>
+      <w:r>
+        <w:rPr>
+          <w:b w:val="0"/>
+          <w:i w:val="0"/>
+        </w:rPr>
+        <w:t xml:space="preserve"> (both required), then </w:t>
+      </w:r>
+      <w:r>
+        <w:rPr>
+          <w:b/>
+          <w:i w:val="0"/>
+        </w:rPr>
+        <w:t>Submit Feedback</w:t>
+      </w:r>
+      <w:r>
+        <w:rPr>
+          <w:b w:val="0"/>
+          <w:i w:val="0"/>
+        </w:rPr>
         <w:t>. It is stored locally.</w:t>
       </w:r>
     </w:p>
@@ -4941,7 +5104,7 @@
         <w:keepNext/>
       </w:pPr>
       <w:r>
-        <w:t>Part 10 - Where data is stored</w:t>
+        <w:t>Part 11 - Where data is stored</w:t>
       </w:r>
     </w:p>
     <w:tbl>
@@ -5133,6 +5296,38 @@
           </w:p>
         </w:tc>
       </w:tr>
+      <w:tr>
+        <w:tc>
+          <w:tcPr>
+            <w:tcW w:type="dxa" w:w="5112"/>
+          </w:tcPr>
+          <w:p>
+            <w:r/>
+            <w:r>
+              <w:rPr>
+                <w:b w:val="0"/>
+                <w:i w:val="0"/>
+              </w:rPr>
+              <w:t>Posture alert endpoint</w:t>
+            </w:r>
+          </w:p>
+        </w:tc>
+        <w:tc>
+          <w:tcPr>
+            <w:tcW w:type="dxa" w:w="5112"/>
+          </w:tcPr>
+          <w:p>
+            <w:r/>
+            <w:r>
+              <w:rPr>
+                <w:b w:val="0"/>
+                <w:i w:val="0"/>
+              </w:rPr>
+              <w:t>Windows Credential Manager for the current Windows user</w:t>
+            </w:r>
+          </w:p>
+        </w:tc>
+      </w:tr>
     </w:tbl>
     <w:p/>
     <w:p>
@@ -5150,7 +5345,7 @@
         <w:keepNext/>
       </w:pPr>
       <w:r>
-        <w:t>Part 11 - Recommended workflow</w:t>
+        <w:t>Part 12 - Recommended workflow</w:t>
       </w:r>
     </w:p>
     <w:p>
@@ -5174,7 +5369,7 @@
           <w:b w:val="0"/>
           <w:i w:val="0"/>
         </w:rPr>
-        <w:t xml:space="preserve">Connect one cloud and run </w:t>
+        <w:t xml:space="preserve">Connect one or more clouds and run </w:t>
       </w:r>
       <w:r>
         <w:rPr>
@@ -5414,7 +5609,7 @@
         <w:keepNext/>
       </w:pPr>
       <w:r>
-        <w:t>Part 12 - Troubleshooting</w:t>
+        <w:t>Part 13 - Troubleshooting</w:t>
       </w:r>
     </w:p>
     <w:tbl>
@@ -5545,7 +5740,21 @@
                 <w:b w:val="0"/>
                 <w:i w:val="0"/>
               </w:rPr>
-              <w:t xml:space="preserve">Large tenant. Wait, or </w:t>
+              <w:t xml:space="preserve">Follow the current provider/account/source in the dashboard. Check </w:t>
+            </w:r>
+            <w:r>
+              <w:rPr>
+                <w:b/>
+                <w:i w:val="0"/>
+              </w:rPr>
+              <w:t>Source coverage</w:t>
+            </w:r>
+            <w:r>
+              <w:rPr>
+                <w:b w:val="0"/>
+                <w:i w:val="0"/>
+              </w:rPr>
+              <w:t xml:space="preserve"> and the application log for a slow CLI command; use </w:t>
             </w:r>
             <w:r>
               <w:rPr>
@@ -5559,7 +5768,7 @@
                 <w:b w:val="0"/>
                 <w:i w:val="0"/>
               </w:rPr>
-              <w:t>; check the log for the slow CLI command</w:t>
+              <w:t xml:space="preserve"> if needed</w:t>
             </w:r>
           </w:p>
         </w:tc>
@@ -5773,7 +5982,7 @@
         <w:keepNext/>
       </w:pPr>
       <w:r>
-        <w:t>Part 13 - Review questions</w:t>
+        <w:t>Part 14 - Review questions</w:t>
       </w:r>
     </w:p>
     <w:p>
@@ -5809,7 +6018,7 @@
           <w:b w:val="0"/>
           <w:i w:val="0"/>
         </w:rPr>
-        <w:t>Which providers can you connect at the same time?</w:t>
+        <w:t>Which providers can be connected at the same time, and how many sign-in flows run at once?</w:t>
       </w:r>
     </w:p>
     <w:p>
@@ -5890,7 +6099,7 @@
         <w:br/>
         <w:t>2. An entitlement is one grant; effective access is the combined result after inheritance and groups.</w:t>
         <w:br/>
-        <w:t>3. One at a time.</w:t>
+        <w:t>3. Azure, AWS and Google Cloud may all remain connected; only one interactive sign-in flow runs at a time.</w:t>
         <w:br/>
         <w:t>4. How much could be affected if the identity or path were abused.</w:t>
         <w:br/>

</xml_diff>